<commit_message>
docs(plan): OpenEdge cross-platform surveys/comparison docs (Sep 13-15)
- openedge_ccf_NeqM_striping_prior_work_cacti_study_2026-09-13
- openedge_phase_pool_robustness_and_prior_work_2026-09-14
- vliw_platforms_with_traces_survey_2026-09-14
- openedge_cross_platform_results_defensible_presentation_2026-09-15
- update 跟其他论文平台比较.docx
</commit_message>
<xml_diff>
--- a/跟其他论文平台比较.docx
+++ b/跟其他论文平台比较.docx
@@ -50,9 +50,6 @@
     <w:p>
       <w:pPr>
         <w:pStyle w:val="1"/>
-        <w:rPr>
-          <w:rFonts w:hint="eastAsia"/>
-        </w:rPr>
       </w:pPr>
       <w:proofErr w:type="spellStart"/>
       <w:r>
@@ -182,11 +179,6 @@
       </w:r>
     </w:p>
     <w:p>
-      <w:pPr>
-        <w:rPr>
-          <w:rFonts w:hint="eastAsia"/>
-        </w:rPr>
-      </w:pPr>
       <w:r>
         <w:t>一句话概括：</w:t>
       </w:r>
@@ -198,13 +190,7 @@
         <w:t>CGRA 是介于 GPU/专用加速器与 FPGA 之间，强调“可重构数据流 + 高能效”的并行计算架构。</w:t>
       </w:r>
     </w:p>
-    <w:p>
-      <w:pPr>
-        <w:rPr>
-          <w:rFonts w:hint="eastAsia"/>
-        </w:rPr>
-      </w:pPr>
-    </w:p>
+    <w:p/>
     <w:p>
       <w:pPr>
         <w:widowControl/>
@@ -409,28 +395,97 @@
         <w:t>。</w:t>
       </w:r>
     </w:p>
-    <w:p>
-      <w:pPr>
+    <w:p/>
+    <w:p>
+      <w:pPr>
+        <w:pStyle w:val="2"/>
+      </w:pPr>
+      <w:r>
+        <w:t>主口径：7 个应用 kernel 同时常驻</w:t>
+      </w:r>
+    </w:p>
+    <w:p>
+      <w:r>
+        <w:t xml:space="preserve">包含 </w:t>
+      </w:r>
+      <w:proofErr w:type="spellStart"/>
+      <w:r>
+        <w:t>dbl_max</w:t>
+      </w:r>
+      <w:proofErr w:type="spellEnd"/>
+      <w:r>
+        <w:t>、</w:t>
+      </w:r>
+      <w:proofErr w:type="spellStart"/>
+      <w:r>
+        <w:t>dbl_min</w:t>
+      </w:r>
+      <w:proofErr w:type="spellEnd"/>
+      <w:r>
+        <w:t>、</w:t>
+      </w:r>
+      <w:proofErr w:type="spellStart"/>
+      <w:r>
+        <w:t>fft_bitrev</w:t>
+      </w:r>
+      <w:proofErr w:type="spellEnd"/>
+      <w:r>
+        <w:t>、</w:t>
+      </w:r>
+      <w:proofErr w:type="spellStart"/>
+      <w:r>
+        <w:t>fft_cplx</w:t>
+      </w:r>
+      <w:proofErr w:type="spellEnd"/>
+      <w:r>
+        <w:t>、</w:t>
+      </w:r>
+      <w:proofErr w:type="spellStart"/>
+      <w:r>
+        <w:t>fft_cplx_forever</w:t>
+      </w:r>
+      <w:proofErr w:type="spellEnd"/>
+      <w:r>
+        <w:t>、</w:t>
+      </w:r>
+      <w:proofErr w:type="spellStart"/>
+      <w:r>
+        <w:t>max_peak</w:t>
+      </w:r>
+      <w:proofErr w:type="spellEnd"/>
+      <w:r>
+        <w:t>、</w:t>
+      </w:r>
+      <w:proofErr w:type="spellStart"/>
+      <w:r>
+        <w:t>min_max_circular</w:t>
+      </w:r>
+      <w:proofErr w:type="spellEnd"/>
+      <w:r>
+        <w:t>；合计 118 个 context 地址、293 个有效 row 字，平均 2.483/4，24 拍四槽全开。118 行能直接放进原平台的 128 深 bank。</w:t>
+      </w:r>
+      <w:r>
         <w:rPr>
           <w:rFonts w:hint="eastAsia"/>
         </w:rPr>
-      </w:pPr>
+        <w:t>所以我的方案没有收益。</w:t>
+      </w:r>
     </w:p>
     <w:p>
       <w:pPr>
         <w:pStyle w:val="2"/>
       </w:pPr>
       <w:r>
-        <w:t>主口径：7 个应用 kernel 同时常驻</w:t>
-      </w:r>
-    </w:p>
-    <w:p>
-      <w:r>
-        <w:t xml:space="preserve">包含 </w:t>
+        <w:t>压力口径：仓库全部 12 个公开映射同时放入</w:t>
+      </w:r>
+    </w:p>
+    <w:p>
+      <w:r>
+        <w:t xml:space="preserve">此口径再加入 </w:t>
       </w:r>
       <w:proofErr w:type="spellStart"/>
       <w:r>
-        <w:t>dbl_max</w:t>
+        <w:t>check_size</w:t>
       </w:r>
       <w:proofErr w:type="spellEnd"/>
       <w:r>
@@ -438,90 +493,18 @@
       </w:r>
       <w:proofErr w:type="spellStart"/>
       <w:r>
-        <w:t>dbl_min</w:t>
+        <w:t>func_test</w:t>
       </w:r>
       <w:proofErr w:type="spellEnd"/>
       <w:r>
-        <w:t>、</w:t>
-      </w:r>
-      <w:proofErr w:type="spellStart"/>
-      <w:r>
-        <w:t>fft_bitrev</w:t>
-      </w:r>
-      <w:proofErr w:type="spellEnd"/>
-      <w:r>
-        <w:t>、</w:t>
-      </w:r>
-      <w:proofErr w:type="spellStart"/>
-      <w:r>
-        <w:t>fft_cplx</w:t>
-      </w:r>
-      <w:proofErr w:type="spellEnd"/>
-      <w:r>
-        <w:t>、</w:t>
-      </w:r>
-      <w:proofErr w:type="spellStart"/>
-      <w:r>
-        <w:t>fft_cplx_forever</w:t>
-      </w:r>
-      <w:proofErr w:type="spellEnd"/>
-      <w:r>
-        <w:t>、</w:t>
-      </w:r>
-      <w:proofErr w:type="spellStart"/>
-      <w:r>
-        <w:t>max_peak</w:t>
-      </w:r>
-      <w:proofErr w:type="spellEnd"/>
-      <w:r>
-        <w:t>、</w:t>
-      </w:r>
-      <w:proofErr w:type="spellStart"/>
-      <w:r>
-        <w:t>min_max_circular</w:t>
-      </w:r>
-      <w:proofErr w:type="spellEnd"/>
-      <w:r>
-        <w:t>；合计 118 个 context 地址、293 个有效 row 字，平均 2.483/4，24 拍四槽全开。118 行能直接放进原平台的 128 深 bank。</w:t>
-      </w:r>
-      <w:r>
-        <w:rPr>
-          <w:rFonts w:hint="eastAsia"/>
-        </w:rPr>
-        <w:t>所以我的方案没有收益。</w:t>
-      </w:r>
-    </w:p>
-    <w:p>
-      <w:pPr>
-        <w:pStyle w:val="2"/>
-      </w:pPr>
-      <w:r>
-        <w:t>压力口径：仓库全部 12 个公开映射同时放入</w:t>
-      </w:r>
-    </w:p>
-    <w:p>
-      <w:r>
-        <w:t xml:space="preserve">此口径再加入 </w:t>
-      </w:r>
-      <w:proofErr w:type="spellStart"/>
-      <w:r>
-        <w:t>check_size</w:t>
-      </w:r>
-      <w:proofErr w:type="spellEnd"/>
-      <w:r>
-        <w:t>、</w:t>
-      </w:r>
-      <w:proofErr w:type="spellStart"/>
-      <w:r>
-        <w:t>func_test</w:t>
-      </w:r>
-      <w:proofErr w:type="spellEnd"/>
-      <w:r>
         <w:t xml:space="preserve"> 和三个 while-loop 利用率测试，共 348 地址、1,020 个有效 row 字。它超过原 128 深物理 context memory，所以代表“把平台扩到可同时放下全部公开映射”的设计实验，不是原芯片现成容量；且 203/348 拍四槽全开，明显受测试程序支配。</w:t>
       </w:r>
     </w:p>
     <w:p>
       <w:r>
+        <w:rPr>
+          <w:noProof/>
+        </w:rPr>
         <w:drawing>
           <wp:inline distT="0" distB="0" distL="0" distR="0" wp14:anchorId="5CBA8D16" wp14:editId="0C7AF562">
             <wp:extent cx="5274310" cy="2210435"/>
@@ -679,55 +662,7 @@
             <w:u w:val="none"/>
             <w:shd w:val="clear" w:color="auto" w:fill="FFFFFF"/>
           </w:rPr>
-          <w:t>Energy-effici</w:t>
-        </w:r>
-        <w:r>
-          <w:rPr>
-            <w:rStyle w:val="af"/>
-            <w:rFonts w:ascii="Segoe UI" w:hAnsi="Segoe UI" w:cs="Segoe UI"/>
-            <w:color w:val="175CD3"/>
-            <w:sz w:val="23"/>
-            <w:szCs w:val="23"/>
-            <w:u w:val="none"/>
-            <w:shd w:val="clear" w:color="auto" w:fill="FFFFFF"/>
-          </w:rPr>
-          <w:t>e</w:t>
-        </w:r>
-        <w:r>
-          <w:rPr>
-            <w:rStyle w:val="af"/>
-            <w:rFonts w:ascii="Segoe UI" w:hAnsi="Segoe UI" w:cs="Segoe UI"/>
-            <w:color w:val="175CD3"/>
-            <w:sz w:val="23"/>
-            <w:szCs w:val="23"/>
-            <w:u w:val="none"/>
-            <w:shd w:val="clear" w:color="auto" w:fill="FFFFFF"/>
-          </w:rPr>
-          <w:t>nt instruction compression with p</w:t>
-        </w:r>
-        <w:r>
-          <w:rPr>
-            <w:rStyle w:val="af"/>
-            <w:rFonts w:ascii="Segoe UI" w:hAnsi="Segoe UI" w:cs="Segoe UI"/>
-            <w:color w:val="175CD3"/>
-            <w:sz w:val="23"/>
-            <w:szCs w:val="23"/>
-            <w:u w:val="none"/>
-            <w:shd w:val="clear" w:color="auto" w:fill="FFFFFF"/>
-          </w:rPr>
-          <w:t>r</w:t>
-        </w:r>
-        <w:r>
-          <w:rPr>
-            <w:rStyle w:val="af"/>
-            <w:rFonts w:ascii="Segoe UI" w:hAnsi="Segoe UI" w:cs="Segoe UI"/>
-            <w:color w:val="175CD3"/>
-            <w:sz w:val="23"/>
-            <w:szCs w:val="23"/>
-            <w:u w:val="none"/>
-            <w:shd w:val="clear" w:color="auto" w:fill="FFFFFF"/>
-          </w:rPr>
-          <w:t>ogrammable dictionaries</w:t>
+          <w:t>Energy-efficient instruction compression with programmable dictionaries</w:t>
         </w:r>
       </w:hyperlink>
       <w:r>
@@ -1548,6 +1483,9 @@
     </w:p>
     <w:p>
       <w:r>
+        <w:rPr>
+          <w:noProof/>
+        </w:rPr>
         <w:drawing>
           <wp:inline distT="0" distB="0" distL="0" distR="0" wp14:anchorId="604390E5" wp14:editId="7DD46F1E">
             <wp:extent cx="5274310" cy="3618865"/>
@@ -1702,9 +1640,6 @@
     <w:p>
       <w:pPr>
         <w:pStyle w:val="1"/>
-        <w:rPr>
-          <w:rFonts w:hint="eastAsia"/>
-        </w:rPr>
       </w:pPr>
       <w:r>
         <w:rPr>
@@ -1812,6 +1747,7 @@
       </w:r>
     </w:p>
     <w:p>
+      <w:bookmarkStart w:id="1" w:name="OLE_LINK2"/>
       <w:r>
         <w:t>compress-vliw/plan/openasip_equal_width_tta_chstone_embench_e0e1e2e6_plan_2026-09-11.html</w:t>
       </w:r>
@@ -1825,6 +1761,253 @@
       </w:r>
       <w:r>
         <w:t>(Multanen)</w:t>
+      </w:r>
+    </w:p>
+    <w:p>
+      <w:r>
+        <w:rPr>
+          <w:rFonts w:hint="eastAsia"/>
+        </w:rPr>
+        <w:t>虽然做了。但放弃这个东西。因为如果做成等宽槽，各槽之间可以随意交换，那么编译器就可以自己把slot排的更均匀，那么相对于纵向压缩就没有收益了。</w:t>
+      </w:r>
+    </w:p>
+    <w:p>
+      <w:r>
+        <w:t>理想外部平台应满足：</w:t>
+      </w:r>
+    </w:p>
+    <w:p>
+      <w:r>
+        <w:t>1. 每周期输出完整宽控制字；</w:t>
+      </w:r>
+    </w:p>
+    <w:p>
+      <w:r>
+        <w:t>2. 逻辑slot等宽或可按少量宽度类别划分；</w:t>
+      </w:r>
+    </w:p>
+    <w:p>
+      <w:r>
+        <w:t>3. slot具有固定功能或空间身份，不能免费互换；</w:t>
+      </w:r>
+    </w:p>
+    <w:p>
+      <w:r>
+        <w:lastRenderedPageBreak/>
+        <w:t>4. 指令中存在明确NOP；</w:t>
+      </w:r>
+    </w:p>
+    <w:p>
+      <w:r>
+        <w:t>5. 每周期有效slot峰值明显小于总slot数，或者各slot长期负载明显不均；</w:t>
+      </w:r>
+    </w:p>
+    <w:p>
+      <w:r>
+        <w:t>6. 有公开RTL、映射结果或逐周期trace；</w:t>
+      </w:r>
+    </w:p>
+    <w:p>
+      <w:r>
+        <w:t>7. 没有已经使用等价的共享bank压缩。</w:t>
+      </w:r>
+    </w:p>
+    <w:p>
+      <w:r>
+        <w:t>关键是第3点。</w:t>
+      </w:r>
+    </w:p>
+    <w:bookmarkEnd w:id="1"/>
+    <w:p>
+      <w:pPr>
+        <w:pStyle w:val="2"/>
+      </w:pPr>
+      <w:r>
+        <w:rPr>
+          <w:rFonts w:hint="eastAsia"/>
+        </w:rPr>
+        <w:t>最终判断</w:t>
+      </w:r>
+    </w:p>
+    <w:p>
+      <w:r>
+        <w:rPr>
+          <w:rFonts w:hint="eastAsia"/>
+        </w:rPr>
+        <w:t>首选还是</w:t>
+      </w:r>
+      <w:proofErr w:type="spellStart"/>
+      <w:r>
+        <w:t>OpenEdgeCGRA</w:t>
+      </w:r>
+      <w:proofErr w:type="spellEnd"/>
+      <w:r>
+        <w:t>：</w:t>
+      </w:r>
+      <w:proofErr w:type="spellStart"/>
+      <w:r>
+        <w:t>OpenEdgeCGRA</w:t>
+      </w:r>
+      <w:proofErr w:type="spellEnd"/>
+      <w:r>
+        <w:t>的PE在计算功能上基本同构，但每个配置槽绑定一个空间坐标、局部状态和邻接通信关系。因此不能通过逐周期的简单槽置换平衡纵向存储；合法置换需要进行跨周期的空间映射、路由和状态重分配。</w:t>
+      </w:r>
+    </w:p>
+    <w:p>
+      <w:r>
+        <w:t>论文里可以把这一点表述为：</w:t>
+      </w:r>
+    </w:p>
+    <w:p>
+      <w:r>
+        <w:t>PE同构性只提供了重新映射的可能性，却不能自动解决各空间位置在整个程序范围内的配置数量不均衡。全局位置置换保持各槽长度的集合及最大值不变；细粒度操作迁移则需要重新进行调度、布线和状态分配，且无法保证无性能损失。E2通过将物理存储lane与逻辑PE位置解耦，使不同逻辑槽共享存储容量，同时保持原有映射和执行周期不变。</w:t>
+      </w:r>
+    </w:p>
+    <w:p/>
+    <w:p>
+      <w:pPr>
+        <w:pStyle w:val="1"/>
+      </w:pPr>
+      <w:r>
+        <w:rPr>
+          <w:rFonts w:hint="eastAsia"/>
+        </w:rPr>
+        <w:t>9月14日</w:t>
+      </w:r>
+    </w:p>
+    <w:p>
+      <w:r>
+        <w:t>openedge_ccf_NeqM_striping_prior_work_cacti_study_2026-09-13</w:t>
+      </w:r>
+      <w:r>
+        <w:t>.html</w:t>
+      </w:r>
+    </w:p>
+    <w:p>
+      <w:pPr>
+        <w:rPr>
+          <w:rFonts w:hint="eastAsia"/>
+        </w:rPr>
+      </w:pPr>
+      <w:r>
+        <w:rPr>
+          <w:rFonts w:hint="eastAsia"/>
+        </w:rPr>
+        <w:t>评价：</w:t>
+      </w:r>
+    </w:p>
+    <w:p>
+      <w:r>
+        <w:t>1. CCF的bank数太多，指令又太少。感觉可以放弃。后续只专注于</w:t>
+      </w:r>
+      <w:proofErr w:type="spellStart"/>
+      <w:r>
+        <w:t>openedge</w:t>
+      </w:r>
+      <w:proofErr w:type="spellEnd"/>
+      <w:r>
+        <w:t xml:space="preserve"> CGRA的实验。</w:t>
+      </w:r>
+    </w:p>
+    <w:p>
+      <w:r>
+        <w:t>2. 在前一次的实验结果上继续进行实验。如果7个应用池上效果不好，那么就在12mapping压力池上完成。需要明确说明这12个mapping每个程序的指令条数等必要信息。</w:t>
+      </w:r>
+    </w:p>
+    <w:p>
+      <w:r>
+        <w:t>3. 另外，本方案条带化+</w:t>
+      </w:r>
+      <w:proofErr w:type="spellStart"/>
+      <w:r>
+        <w:t>phase_q</w:t>
+      </w:r>
+      <w:proofErr w:type="spellEnd"/>
+      <w:r>
+        <w:t>不需要额外存储什么呀？每个程序进来都会输入对应的</w:t>
+      </w:r>
+      <w:proofErr w:type="spellStart"/>
+      <w:r>
+        <w:t>addr</w:t>
+      </w:r>
+      <w:proofErr w:type="spellEnd"/>
+      <w:r>
+        <w:t>和</w:t>
+      </w:r>
+      <w:proofErr w:type="spellStart"/>
+      <w:r>
+        <w:t>phase_q</w:t>
+      </w:r>
+      <w:proofErr w:type="spellEnd"/>
+      <w:r>
+        <w:t>，所以我认为有效逻辑bit不用给每个程序增加2bit。</w:t>
+      </w:r>
+    </w:p>
+    <w:p>
+      <w:r>
+        <w:t>4. 静态完整指令字典是怎样构建的，它是否有对应的论文？论述Lee2018和Multanen2024在这个平台上的实现方法、特点与结果分析。</w:t>
+      </w:r>
+    </w:p>
+    <w:p>
+      <w:r>
+        <w:lastRenderedPageBreak/>
+        <w:t>5. 是否能构造出审稿人不会质疑又对我的方案更有利的实验？比如扩大压力池？请用实验结果回答。</w:t>
+      </w:r>
+    </w:p>
+    <w:p/>
+    <w:p>
+      <w:r>
+        <w:t>openedge_phase_pool_robustness_and_prior_work_2026-09-14</w:t>
+      </w:r>
+      <w:r>
+        <w:t>.html</w:t>
+      </w:r>
+    </w:p>
+    <w:p>
+      <w:pPr>
+        <w:rPr>
+          <w:rFonts w:hint="eastAsia"/>
+        </w:rPr>
+      </w:pPr>
+      <w:r>
+        <w:rPr>
+          <w:rFonts w:hint="eastAsia"/>
+        </w:rPr>
+        <w:t>评价：</w:t>
+      </w:r>
+    </w:p>
+    <w:p>
+      <w:r>
+        <w:t>新增独立、功能可验证的</w:t>
+      </w:r>
+      <w:proofErr w:type="spellStart"/>
+      <w:r>
+        <w:t>OpenEdge</w:t>
+      </w:r>
+      <w:proofErr w:type="spellEnd"/>
+      <w:r>
+        <w:t xml:space="preserve"> mapping：选择</w:t>
+      </w:r>
+      <w:proofErr w:type="spellStart"/>
+      <w:r>
+        <w:t>PolyBench</w:t>
+      </w:r>
+      <w:proofErr w:type="spellEnd"/>
+      <w:r>
+        <w:t>/</w:t>
+      </w:r>
+      <w:proofErr w:type="spellStart"/>
+      <w:r>
+        <w:t>MachSuite</w:t>
+      </w:r>
+      <w:proofErr w:type="spellEnd"/>
+      <w:r>
+        <w:t>等循环kernel，按当前32-bit ISA映射，生成instructions_*.py，用官方行为模拟器对照C参考输出，再纳入池统计。</w:t>
+      </w:r>
+    </w:p>
+    <w:p>
+      <w:r>
+        <w:t>因为现在你每一个mapping里面指令条数太少了。这样SRAM本身还不到0.1平方毫米，压缩有什么意义？请造出独立、功能可验证并且指令条数较大的实验，然后重新给我生成这个报告。</w:t>
       </w:r>
     </w:p>
     <w:sectPr>
@@ -3288,6 +3471,7 @@
   <w:style w:type="character" w:default="1" w:styleId="a0">
     <w:name w:val="Default Paragraph Font"/>
     <w:uiPriority w:val="1"/>
+    <w:semiHidden/>
     <w:unhideWhenUsed/>
   </w:style>
   <w:style w:type="table" w:default="1" w:styleId="a1">

</xml_diff>